<commit_message>
Integrated ChatGroq and few tweaks over there too
</commit_message>
<xml_diff>
--- a/Proper MLOPs like structure/data/raw/agreement-between-film-producers-and-distributors.docx
+++ b/Proper MLOPs like structure/data/raw/agreement-between-film-producers-and-distributors.docx
@@ -1,6 +1,6 @@
 
 <file path=word/document.xml><?xml version="1.0" encoding="utf-8"?>
-<w:document xmlns:ve="http://schemas.openxmlformats.org/markup-compatibility/2006" xmlns:o="urn:schemas-microsoft-com:office:office" xmlns:r="http://schemas.openxmlformats.org/officeDocument/2006/relationships" xmlns:m="http://schemas.openxmlformats.org/officeDocument/2006/math" xmlns:v="urn:schemas-microsoft-com:vml" xmlns:wp="http://schemas.openxmlformats.org/drawingml/2006/wordprocessingDrawing" xmlns:w10="urn:schemas-microsoft-com:office:word" xmlns:w="http://schemas.openxmlformats.org/wordprocessingml/2006/main" xmlns:wne="http://schemas.microsoft.com/office/word/2006/wordml">
+<w:document xmlns:wpc="http://schemas.microsoft.com/office/word/2010/wordprocessingCanvas" xmlns:cx="http://schemas.microsoft.com/office/drawing/2014/chartex" xmlns:cx1="http://schemas.microsoft.com/office/drawing/2015/9/8/chartex" xmlns:cx2="http://schemas.microsoft.com/office/drawing/2015/10/21/chartex" xmlns:cx3="http://schemas.microsoft.com/office/drawing/2016/5/9/chartex" xmlns:cx4="http://schemas.microsoft.com/office/drawing/2016/5/10/chartex" xmlns:cx5="http://schemas.microsoft.com/office/drawing/2016/5/11/chartex" xmlns:cx6="http://schemas.microsoft.com/office/drawing/2016/5/12/chartex" xmlns:cx7="http://schemas.microsoft.com/office/drawing/2016/5/13/chartex" xmlns:cx8="http://schemas.microsoft.com/office/drawing/2016/5/14/chartex" xmlns:mc="http://schemas.openxmlformats.org/markup-compatibility/2006" xmlns:aink="http://schemas.microsoft.com/office/drawing/2016/ink" xmlns:am3d="http://schemas.microsoft.com/office/drawing/2017/model3d" xmlns:o="urn:schemas-microsoft-com:office:office" xmlns:oel="http://schemas.microsoft.com/office/2019/extlst" xmlns:r="http://schemas.openxmlformats.org/officeDocument/2006/relationships" xmlns:m="http://schemas.openxmlformats.org/officeDocument/2006/math" xmlns:v="urn:schemas-microsoft-com:vml" xmlns:wp14="http://schemas.microsoft.com/office/word/2010/wordprocessingDrawing" xmlns:wp="http://schemas.openxmlformats.org/drawingml/2006/wordprocessingDrawing" xmlns:w10="urn:schemas-microsoft-com:office:word" xmlns:w="http://schemas.openxmlformats.org/wordprocessingml/2006/main" xmlns:w14="http://schemas.microsoft.com/office/word/2010/wordml" xmlns:w15="http://schemas.microsoft.com/office/word/2012/wordml" xmlns:w16cex="http://schemas.microsoft.com/office/word/2018/wordml/cex" xmlns:w16cid="http://schemas.microsoft.com/office/word/2016/wordml/cid" xmlns:w16="http://schemas.microsoft.com/office/word/2018/wordml" xmlns:w16du="http://schemas.microsoft.com/office/word/2023/wordml/word16du" xmlns:w16sdtdh="http://schemas.microsoft.com/office/word/2020/wordml/sdtdatahash" xmlns:w16sdtfl="http://schemas.microsoft.com/office/word/2024/wordml/sdtformatlock" xmlns:w16se="http://schemas.microsoft.com/office/word/2015/wordml/symex" xmlns:wpg="http://schemas.microsoft.com/office/word/2010/wordprocessingGroup" xmlns:wpi="http://schemas.microsoft.com/office/word/2010/wordprocessingInk" xmlns:wne="http://schemas.microsoft.com/office/word/2006/wordml" xmlns:wps="http://schemas.microsoft.com/office/word/2010/wordprocessingShape" mc:Ignorable="w14 w15 w16se w16cid w16 w16cex w16sdtdh w16sdtfl w16du wp14">
   <w:body>
     <w:p>
       <w:pPr>
@@ -103,18 +103,8 @@
           <w:shd w:val="clear" w:color="auto" w:fill="FFFFFF"/>
         </w:rPr>
         <w:br/>
-      </w:r>
-      <w:proofErr w:type="spellStart"/>
-      <w:r>
-        <w:rPr>
-          <w:rFonts w:eastAsia="Times New Roman" w:cs="Times New Roman"/>
-          <w:bCs/>
-          <w:color w:val="000000"/>
-          <w:shd w:val="clear" w:color="auto" w:fill="FFFFFF"/>
-        </w:rPr>
         <w:t>Ramchandren</w:t>
       </w:r>
-      <w:proofErr w:type="spellEnd"/>
       <w:r>
         <w:rPr>
           <w:rFonts w:eastAsia="Times New Roman" w:cs="Times New Roman"/>
@@ -315,19 +305,8 @@
           <w:color w:val="000000"/>
           <w:shd w:val="clear" w:color="auto" w:fill="FFFFFF"/>
         </w:rPr>
-        <w:t xml:space="preserve">primarily of producing a </w:t>
-      </w:r>
-      <w:proofErr w:type="spellStart"/>
-      <w:r>
-        <w:rPr>
-          <w:rFonts w:eastAsia="Times New Roman" w:cs="Times New Roman"/>
-          <w:bCs/>
-          <w:color w:val="000000"/>
-          <w:shd w:val="clear" w:color="auto" w:fill="FFFFFF"/>
-        </w:rPr>
-        <w:t>telgu</w:t>
-      </w:r>
-      <w:proofErr w:type="spellEnd"/>
+        <w:t>primarily of producing a telgu</w:t>
+      </w:r>
       <w:r>
         <w:rPr>
           <w:rFonts w:eastAsia="Times New Roman" w:cs="Times New Roman"/>
@@ -517,7 +496,6 @@
         </w:rPr>
         <w:t xml:space="preserve"> </w:t>
       </w:r>
-      <w:proofErr w:type="spellStart"/>
       <w:r>
         <w:rPr>
           <w:rFonts w:eastAsia="Times New Roman" w:cs="Times New Roman"/>
@@ -527,7 +505,6 @@
         </w:rPr>
         <w:t>instalments</w:t>
       </w:r>
-      <w:proofErr w:type="spellEnd"/>
       <w:r>
         <w:rPr>
           <w:rFonts w:eastAsia="Times New Roman" w:cs="Times New Roman"/>
@@ -698,37 +675,16 @@
           <w:color w:val="000000"/>
           <w:shd w:val="clear" w:color="auto" w:fill="FFFFFF"/>
         </w:rPr>
-        <w:t xml:space="preserve">tion of the above stated </w:t>
-      </w:r>
-      <w:proofErr w:type="spellStart"/>
-      <w:r>
-        <w:rPr>
-          <w:rFonts w:eastAsia="Times New Roman" w:cs="Times New Roman"/>
-          <w:bCs/>
-          <w:color w:val="000000"/>
-          <w:shd w:val="clear" w:color="auto" w:fill="FFFFFF"/>
-        </w:rPr>
-        <w:t>telgu</w:t>
-      </w:r>
-      <w:proofErr w:type="spellEnd"/>
-      <w:r>
-        <w:rPr>
-          <w:rFonts w:eastAsia="Times New Roman" w:cs="Times New Roman"/>
-          <w:bCs/>
-          <w:color w:val="000000"/>
-          <w:shd w:val="clear" w:color="auto" w:fill="FFFFFF"/>
-        </w:rPr>
-        <w:t xml:space="preserve"> talkie picture a sum of </w:t>
-      </w:r>
-      <w:proofErr w:type="gramStart"/>
-      <w:r>
-        <w:rPr>
-          <w:rFonts w:eastAsia="Times New Roman" w:cs="Times New Roman"/>
-          <w:bCs/>
-          <w:color w:val="000000"/>
-          <w:shd w:val="clear" w:color="auto" w:fill="FFFFFF"/>
-        </w:rPr>
-        <w:t xml:space="preserve">Rs. </w:t>
+        <w:t>tion of the above stated telgu</w:t>
+      </w:r>
+      <w:r>
+        <w:rPr>
+          <w:rFonts w:eastAsia="Times New Roman" w:cs="Times New Roman"/>
+          <w:bCs/>
+          <w:color w:val="000000"/>
+          <w:shd w:val="clear" w:color="auto" w:fill="FFFFFF"/>
+        </w:rPr>
+        <w:t xml:space="preserve"> talkie picture a sum of Rs. </w:t>
       </w:r>
       <w:r>
         <w:rPr>
@@ -746,17 +702,7 @@
           <w:color w:val="000000"/>
           <w:shd w:val="clear" w:color="auto" w:fill="FFFFFF"/>
         </w:rPr>
-        <w:t>..............payable</w:t>
-      </w:r>
-      <w:proofErr w:type="gramEnd"/>
-      <w:r>
-        <w:rPr>
-          <w:rFonts w:eastAsia="Times New Roman" w:cs="Times New Roman"/>
-          <w:bCs/>
-          <w:color w:val="000000"/>
-          <w:shd w:val="clear" w:color="auto" w:fill="FFFFFF"/>
-        </w:rPr>
-        <w:t xml:space="preserve"> in the following manner: </w:t>
+        <w:t>..............payable in the following manner: </w:t>
       </w:r>
       <w:r>
         <w:rPr>
@@ -878,27 +824,7 @@
           <w:shd w:val="clear" w:color="auto" w:fill="FFFFFF"/>
         </w:rPr>
         <w:lastRenderedPageBreak/>
-        <w:t xml:space="preserve">(c) That the party after providing the expenses as in </w:t>
-      </w:r>
-      <w:proofErr w:type="spellStart"/>
-      <w:r>
-        <w:rPr>
-          <w:rFonts w:eastAsia="Times New Roman" w:cs="Times New Roman"/>
-          <w:bCs/>
-          <w:color w:val="000000"/>
-          <w:shd w:val="clear" w:color="auto" w:fill="FFFFFF"/>
-        </w:rPr>
-        <w:t>els</w:t>
-      </w:r>
-      <w:proofErr w:type="spellEnd"/>
-      <w:r>
-        <w:rPr>
-          <w:rFonts w:eastAsia="Times New Roman" w:cs="Times New Roman"/>
-          <w:bCs/>
-          <w:color w:val="000000"/>
-          <w:shd w:val="clear" w:color="auto" w:fill="FFFFFF"/>
-        </w:rPr>
-        <w:t>. (a) and {6} with an approximate amount of Rs. ............... shall be paying firstly the balance of Rs.................... out of Rs................. so consented to be advanced, up to the rush prints with progress of shooting of aforesaid picture per instalments as and when needed by the producers provided however, that the producers shall not be entitled to demand from the party any such advance of money unless and until the producers has completed approximately three thousand feet edited shots of this picture aforesaid. </w:t>
+        <w:t>(c) That the party after providing the expenses as in els. (a) and {6} with an approximate amount of Rs. ............... shall be paying firstly the balance of Rs.................... out of Rs................. so consented to be advanced, up to the rush prints with progress of shooting of aforesaid picture per instalments as and when needed by the producers provided however, that the producers shall not be entitled to demand from the party any such advance of money unless and until the producers has completed approximately three thousand feet edited shots of this picture aforesaid. </w:t>
       </w:r>
     </w:p>
     <w:p>
@@ -1067,36 +993,16 @@
           <w:shd w:val="clear" w:color="auto" w:fill="FFFFFF"/>
         </w:rPr>
         <w:br/>
-        <w:t xml:space="preserve">7. That the party undertakes in arranging public exhibition of said </w:t>
-      </w:r>
-      <w:proofErr w:type="gramStart"/>
-      <w:r>
-        <w:rPr>
-          <w:rFonts w:eastAsia="Times New Roman" w:cs="Times New Roman"/>
-          <w:bCs/>
-          <w:color w:val="000000"/>
-          <w:shd w:val="clear" w:color="auto" w:fill="FFFFFF"/>
-        </w:rPr>
-        <w:t>picture ....</w:t>
-      </w:r>
-      <w:r>
-        <w:rPr>
-          <w:rFonts w:eastAsia="Times New Roman" w:cs="Times New Roman"/>
-          <w:bCs/>
-          <w:color w:val="000000"/>
-          <w:shd w:val="clear" w:color="auto" w:fill="FFFFFF"/>
-        </w:rPr>
-        <w:t>...................</w:t>
-      </w:r>
-      <w:proofErr w:type="gramEnd"/>
-      <w:r>
-        <w:rPr>
-          <w:rFonts w:eastAsia="Times New Roman" w:cs="Times New Roman"/>
-          <w:bCs/>
-          <w:color w:val="000000"/>
-          <w:shd w:val="clear" w:color="auto" w:fill="FFFFFF"/>
-        </w:rPr>
-        <w:t xml:space="preserve"> within ……</w:t>
+        <w:t>7. That the party undertakes in arranging public exhibition of said picture ....</w:t>
+      </w:r>
+      <w:r>
+        <w:rPr>
+          <w:rFonts w:eastAsia="Times New Roman" w:cs="Times New Roman"/>
+          <w:bCs/>
+          <w:color w:val="000000"/>
+          <w:shd w:val="clear" w:color="auto" w:fill="FFFFFF"/>
+        </w:rPr>
+        <w:t>................... within ……</w:t>
       </w:r>
       <w:r>
         <w:rPr>
@@ -1214,27 +1120,7 @@
           <w:shd w:val="clear" w:color="auto" w:fill="FFFFFF"/>
         </w:rPr>
         <w:br/>
-        <w:t>(</w:t>
-      </w:r>
-      <w:proofErr w:type="spellStart"/>
-      <w:r>
-        <w:rPr>
-          <w:rFonts w:eastAsia="Times New Roman" w:cs="Times New Roman"/>
-          <w:bCs/>
-          <w:color w:val="000000"/>
-          <w:shd w:val="clear" w:color="auto" w:fill="FFFFFF"/>
-        </w:rPr>
-        <w:t>i</w:t>
-      </w:r>
-      <w:proofErr w:type="spellEnd"/>
-      <w:r>
-        <w:rPr>
-          <w:rFonts w:eastAsia="Times New Roman" w:cs="Times New Roman"/>
-          <w:bCs/>
-          <w:color w:val="000000"/>
-          <w:shd w:val="clear" w:color="auto" w:fill="FFFFFF"/>
-        </w:rPr>
-        <w:t xml:space="preserve">) Having deducting </w:t>
+        <w:t xml:space="preserve">(i) Having deducting </w:t>
       </w:r>
       <w:r>
         <w:rPr>
@@ -1280,27 +1166,7 @@
           <w:color w:val="000000"/>
           <w:shd w:val="clear" w:color="auto" w:fill="FFFFFF"/>
         </w:rPr>
-        <w:t xml:space="preserve">............ </w:t>
-      </w:r>
-      <w:proofErr w:type="gramStart"/>
-      <w:r>
-        <w:rPr>
-          <w:rFonts w:eastAsia="Times New Roman" w:cs="Times New Roman"/>
-          <w:bCs/>
-          <w:color w:val="000000"/>
-          <w:shd w:val="clear" w:color="auto" w:fill="FFFFFF"/>
-        </w:rPr>
-        <w:t>from</w:t>
-      </w:r>
-      <w:proofErr w:type="gramEnd"/>
-      <w:r>
-        <w:rPr>
-          <w:rFonts w:eastAsia="Times New Roman" w:cs="Times New Roman"/>
-          <w:bCs/>
-          <w:color w:val="000000"/>
-          <w:shd w:val="clear" w:color="auto" w:fill="FFFFFF"/>
-        </w:rPr>
-        <w:t xml:space="preserve"> balance therefrom to liquidate the principal of the amount of the advances made and the balance </w:t>
+        <w:t xml:space="preserve">............ from balance therefrom to liquidate the principal of the amount of the advances made and the balance </w:t>
       </w:r>
       <w:r>
         <w:rPr>
@@ -1318,27 +1184,7 @@
           <w:color w:val="000000"/>
           <w:shd w:val="clear" w:color="auto" w:fill="FFFFFF"/>
         </w:rPr>
-        <w:t xml:space="preserve">.......... </w:t>
-      </w:r>
-      <w:proofErr w:type="gramStart"/>
-      <w:r>
-        <w:rPr>
-          <w:rFonts w:eastAsia="Times New Roman" w:cs="Times New Roman"/>
-          <w:bCs/>
-          <w:color w:val="000000"/>
-          <w:shd w:val="clear" w:color="auto" w:fill="FFFFFF"/>
-        </w:rPr>
-        <w:t>shall</w:t>
-      </w:r>
-      <w:proofErr w:type="gramEnd"/>
-      <w:r>
-        <w:rPr>
-          <w:rFonts w:eastAsia="Times New Roman" w:cs="Times New Roman"/>
-          <w:bCs/>
-          <w:color w:val="000000"/>
-          <w:shd w:val="clear" w:color="auto" w:fill="FFFFFF"/>
-        </w:rPr>
-        <w:t xml:space="preserve"> be payable directly to producers or to its authorized agent, persons or company monthly showing per statement collection received from date of release. </w:t>
+        <w:t>.......... shall be payable directly to producers or to its authorized agent, persons or company monthly showing per statement collection received from date of release. </w:t>
       </w:r>
       <w:r>
         <w:rPr>
@@ -1494,76 +1340,82 @@
           <w:color w:val="000000"/>
           <w:shd w:val="clear" w:color="auto" w:fill="FFFFFF"/>
         </w:rPr>
-        <w:t>by first shooting date in conformity with cl. 4(c) stated above </w:t>
-      </w:r>
-      <w:bookmarkStart w:id="0" w:name="_GoBack"/>
-      <w:bookmarkEnd w:id="0"/>
-    </w:p>
-    <w:p>
-      <w:pPr>
-        <w:spacing w:line="360" w:lineRule="auto"/>
-        <w:jc w:val="both"/>
-        <w:rPr>
-          <w:rFonts w:eastAsia="Times New Roman" w:cs="Times New Roman"/>
-          <w:bCs/>
-          <w:color w:val="000000"/>
-          <w:shd w:val="clear" w:color="auto" w:fill="FFFFFF"/>
-        </w:rPr>
-      </w:pPr>
-    </w:p>
-    <w:p>
-      <w:pPr>
-        <w:spacing w:line="360" w:lineRule="auto"/>
-        <w:jc w:val="both"/>
-        <w:rPr>
-          <w:rFonts w:eastAsia="Times New Roman" w:cs="Times New Roman"/>
-          <w:bCs/>
-          <w:color w:val="000000"/>
-          <w:shd w:val="clear" w:color="auto" w:fill="FFFFFF"/>
-        </w:rPr>
-      </w:pPr>
-    </w:p>
-    <w:p>
-      <w:pPr>
-        <w:spacing w:line="360" w:lineRule="auto"/>
-        <w:jc w:val="both"/>
-        <w:rPr>
-          <w:rFonts w:eastAsia="Times New Roman" w:cs="Times New Roman"/>
-          <w:bCs/>
-          <w:color w:val="000000"/>
-          <w:shd w:val="clear" w:color="auto" w:fill="FFFFFF"/>
-        </w:rPr>
-      </w:pPr>
-    </w:p>
-    <w:p>
-      <w:pPr>
-        <w:spacing w:line="360" w:lineRule="auto"/>
-        <w:jc w:val="both"/>
-        <w:rPr>
-          <w:rFonts w:eastAsia="Times New Roman" w:cs="Times New Roman"/>
-          <w:bCs/>
-          <w:color w:val="000000"/>
-          <w:shd w:val="clear" w:color="auto" w:fill="FFFFFF"/>
-        </w:rPr>
-      </w:pPr>
-      <w:r>
-        <w:rPr>
-          <w:rFonts w:eastAsia="Times New Roman" w:cs="Times New Roman"/>
-          <w:bCs/>
-          <w:color w:val="000000"/>
-          <w:shd w:val="clear" w:color="auto" w:fill="FFFFFF"/>
-        </w:rPr>
-        <w:t xml:space="preserve">(a) That the producers will bear right in raising loan for balance amount of </w:t>
-      </w:r>
-      <w:proofErr w:type="gramStart"/>
-      <w:r>
-        <w:rPr>
-          <w:rFonts w:eastAsia="Times New Roman" w:cs="Times New Roman"/>
-          <w:bCs/>
-          <w:color w:val="000000"/>
-          <w:shd w:val="clear" w:color="auto" w:fill="FFFFFF"/>
-        </w:rPr>
-        <w:t xml:space="preserve">Rs. </w:t>
+        <w:t>by first shooting date in conformity</w:t>
+      </w:r>
+      <w:r>
+        <w:rPr>
+          <w:rFonts w:eastAsia="Times New Roman" w:cs="Times New Roman"/>
+          <w:bCs/>
+          <w:color w:val="000000"/>
+          <w:shd w:val="clear" w:color="auto" w:fill="FFFFFF"/>
+        </w:rPr>
+        <w:t>.</w:t>
+      </w:r>
+      <w:r>
+        <w:rPr>
+          <w:rFonts w:eastAsia="Times New Roman" w:cs="Times New Roman"/>
+          <w:bCs/>
+          <w:color w:val="000000"/>
+          <w:shd w:val="clear" w:color="auto" w:fill="FFFFFF"/>
+        </w:rPr>
+        <w:t xml:space="preserve"> </w:t>
+      </w:r>
+    </w:p>
+    <w:p>
+      <w:pPr>
+        <w:spacing w:line="360" w:lineRule="auto"/>
+        <w:jc w:val="both"/>
+        <w:rPr>
+          <w:rFonts w:eastAsia="Times New Roman" w:cs="Times New Roman"/>
+          <w:bCs/>
+          <w:color w:val="000000"/>
+          <w:shd w:val="clear" w:color="auto" w:fill="FFFFFF"/>
+        </w:rPr>
+      </w:pPr>
+    </w:p>
+    <w:p>
+      <w:pPr>
+        <w:spacing w:line="360" w:lineRule="auto"/>
+        <w:jc w:val="both"/>
+        <w:rPr>
+          <w:rFonts w:eastAsia="Times New Roman" w:cs="Times New Roman"/>
+          <w:bCs/>
+          <w:color w:val="000000"/>
+          <w:shd w:val="clear" w:color="auto" w:fill="FFFFFF"/>
+        </w:rPr>
+      </w:pPr>
+    </w:p>
+    <w:p>
+      <w:pPr>
+        <w:spacing w:line="360" w:lineRule="auto"/>
+        <w:jc w:val="both"/>
+        <w:rPr>
+          <w:rFonts w:eastAsia="Times New Roman" w:cs="Times New Roman"/>
+          <w:bCs/>
+          <w:color w:val="000000"/>
+          <w:shd w:val="clear" w:color="auto" w:fill="FFFFFF"/>
+        </w:rPr>
+      </w:pPr>
+    </w:p>
+    <w:p>
+      <w:pPr>
+        <w:spacing w:line="360" w:lineRule="auto"/>
+        <w:jc w:val="both"/>
+        <w:rPr>
+          <w:rFonts w:eastAsia="Times New Roman" w:cs="Times New Roman"/>
+          <w:bCs/>
+          <w:color w:val="000000"/>
+          <w:shd w:val="clear" w:color="auto" w:fill="FFFFFF"/>
+        </w:rPr>
+      </w:pPr>
+      <w:r>
+        <w:rPr>
+          <w:rFonts w:eastAsia="Times New Roman" w:cs="Times New Roman"/>
+          <w:bCs/>
+          <w:color w:val="000000"/>
+          <w:shd w:val="clear" w:color="auto" w:fill="FFFFFF"/>
+        </w:rPr>
+        <w:t xml:space="preserve">(a) That the producers will bear right in raising loan for balance amount of Rs. </w:t>
       </w:r>
       <w:r>
         <w:rPr>
@@ -1581,37 +1433,7 @@
           <w:color w:val="000000"/>
           <w:shd w:val="clear" w:color="auto" w:fill="FFFFFF"/>
         </w:rPr>
-        <w:t>...............</w:t>
-      </w:r>
-      <w:proofErr w:type="gramEnd"/>
-      <w:r>
-        <w:rPr>
-          <w:rFonts w:eastAsia="Times New Roman" w:cs="Times New Roman"/>
-          <w:bCs/>
-          <w:color w:val="000000"/>
-          <w:shd w:val="clear" w:color="auto" w:fill="FFFFFF"/>
-        </w:rPr>
-        <w:t xml:space="preserve"> </w:t>
-      </w:r>
-      <w:proofErr w:type="gramStart"/>
-      <w:r>
-        <w:rPr>
-          <w:rFonts w:eastAsia="Times New Roman" w:cs="Times New Roman"/>
-          <w:bCs/>
-          <w:color w:val="000000"/>
-          <w:shd w:val="clear" w:color="auto" w:fill="FFFFFF"/>
-        </w:rPr>
-        <w:t>or</w:t>
-      </w:r>
-      <w:proofErr w:type="gramEnd"/>
-      <w:r>
-        <w:rPr>
-          <w:rFonts w:eastAsia="Times New Roman" w:cs="Times New Roman"/>
-          <w:bCs/>
-          <w:color w:val="000000"/>
-          <w:shd w:val="clear" w:color="auto" w:fill="FFFFFF"/>
-        </w:rPr>
-        <w:t xml:space="preserve"> such amount considered necessary for completing said picture over and above the sum of Rs</w:t>
+        <w:t>............... or such amount considered necessary for completing said picture over and above the sum of Rs</w:t>
       </w:r>
       <w:r>
         <w:rPr>
@@ -1629,27 +1451,7 @@
           <w:color w:val="000000"/>
           <w:shd w:val="clear" w:color="auto" w:fill="FFFFFF"/>
         </w:rPr>
-        <w:t xml:space="preserve">............. </w:t>
-      </w:r>
-      <w:proofErr w:type="gramStart"/>
-      <w:r>
-        <w:rPr>
-          <w:rFonts w:eastAsia="Times New Roman" w:cs="Times New Roman"/>
-          <w:bCs/>
-          <w:color w:val="000000"/>
-          <w:shd w:val="clear" w:color="auto" w:fill="FFFFFF"/>
-        </w:rPr>
-        <w:t>to</w:t>
-      </w:r>
-      <w:proofErr w:type="gramEnd"/>
-      <w:r>
-        <w:rPr>
-          <w:rFonts w:eastAsia="Times New Roman" w:cs="Times New Roman"/>
-          <w:bCs/>
-          <w:color w:val="000000"/>
-          <w:shd w:val="clear" w:color="auto" w:fill="FFFFFF"/>
-        </w:rPr>
-        <w:t xml:space="preserve"> be advanced by the party as aforesaid and the party shall bear no objection to that and will be added as a confirming party to said transaction. </w:t>
+        <w:t>............. to be advanced by the party as aforesaid and the party shall bear no objection to that and will be added as a confirming party to said transaction. </w:t>
       </w:r>
     </w:p>
     <w:p>
@@ -1825,47 +1627,7 @@
           <w:shd w:val="clear" w:color="auto" w:fill="FFFFFF"/>
         </w:rPr>
         <w:br/>
-        <w:t xml:space="preserve">13. If either party </w:t>
-      </w:r>
-      <w:proofErr w:type="gramStart"/>
-      <w:r>
-        <w:rPr>
-          <w:rFonts w:eastAsia="Times New Roman" w:cs="Times New Roman"/>
-          <w:bCs/>
-          <w:color w:val="000000"/>
-          <w:shd w:val="clear" w:color="auto" w:fill="FFFFFF"/>
-        </w:rPr>
-        <w:t>do</w:t>
-      </w:r>
-      <w:proofErr w:type="gramEnd"/>
-      <w:r>
-        <w:rPr>
-          <w:rFonts w:eastAsia="Times New Roman" w:cs="Times New Roman"/>
-          <w:bCs/>
-          <w:color w:val="000000"/>
-          <w:shd w:val="clear" w:color="auto" w:fill="FFFFFF"/>
-        </w:rPr>
-        <w:t xml:space="preserve"> not act according to enactments of agreement, the aggrieved party firstly try to decide the controverted points mutually and amicably, failing this the controverted point shall be referred to arbitration according to enactments of Arbitration and Conciliation Act 1996. If, than the arbitrator </w:t>
-      </w:r>
-      <w:proofErr w:type="spellStart"/>
-      <w:r>
-        <w:rPr>
-          <w:rFonts w:eastAsia="Times New Roman" w:cs="Times New Roman"/>
-          <w:bCs/>
-          <w:color w:val="000000"/>
-          <w:shd w:val="clear" w:color="auto" w:fill="FFFFFF"/>
-        </w:rPr>
-        <w:t>mados</w:t>
-      </w:r>
-      <w:proofErr w:type="spellEnd"/>
-      <w:r>
-        <w:rPr>
-          <w:rFonts w:eastAsia="Times New Roman" w:cs="Times New Roman"/>
-          <w:bCs/>
-          <w:color w:val="000000"/>
-          <w:shd w:val="clear" w:color="auto" w:fill="FFFFFF"/>
-        </w:rPr>
-        <w:t xml:space="preserve"> not decide or make award on referred point, then the concerned parties may adjudged the controversy by resorting to appropriate legal proceedings. </w:t>
+        <w:t>13. If either party do not act according to enactments of agreement, the aggrieved party firstly try to decide the controverted points mutually and amicably, failing this the controverted point shall be referred to arbitration according to enactments of Arbitration and Conciliation Act 1996. If, than the arbitrator mados not decide or make award on referred point, then the concerned parties may adjudged the controversy by resorting to appropriate legal proceedings. </w:t>
       </w:r>
     </w:p>
     <w:p>
@@ -2136,7 +1898,7 @@
 </file>
 
 <file path=word/styles.xml><?xml version="1.0" encoding="utf-8"?>
-<w:styles xmlns:r="http://schemas.openxmlformats.org/officeDocument/2006/relationships" xmlns:w="http://schemas.openxmlformats.org/wordprocessingml/2006/main">
+<w:styles xmlns:mc="http://schemas.openxmlformats.org/markup-compatibility/2006" xmlns:r="http://schemas.openxmlformats.org/officeDocument/2006/relationships" xmlns:w="http://schemas.openxmlformats.org/wordprocessingml/2006/main" xmlns:w14="http://schemas.microsoft.com/office/word/2010/wordml" xmlns:w15="http://schemas.microsoft.com/office/word/2012/wordml" xmlns:w16cex="http://schemas.microsoft.com/office/word/2018/wordml/cex" xmlns:w16cid="http://schemas.microsoft.com/office/word/2016/wordml/cid" xmlns:w16="http://schemas.microsoft.com/office/word/2018/wordml" xmlns:w16du="http://schemas.microsoft.com/office/word/2023/wordml/word16du" xmlns:w16sdtdh="http://schemas.microsoft.com/office/word/2020/wordml/sdtdatahash" xmlns:w16sdtfl="http://schemas.microsoft.com/office/word/2024/wordml/sdtformatlock" xmlns:w16se="http://schemas.microsoft.com/office/word/2015/wordml/symex" mc:Ignorable="w14 w15 w16se w16cid w16 w16cex w16sdtdh w16sdtfl w16du">
   <w:docDefaults>
     <w:rPrDefault>
       <w:rPr>
@@ -2152,144 +1914,383 @@
       </w:pPr>
     </w:pPrDefault>
   </w:docDefaults>
-  <w:latentStyles w:defLockedState="0" w:defUIPriority="99" w:defSemiHidden="1" w:defUnhideWhenUsed="1" w:defQFormat="0" w:count="267">
-    <w:lsdException w:name="Normal" w:semiHidden="0" w:uiPriority="0" w:unhideWhenUsed="0" w:qFormat="1"/>
-    <w:lsdException w:name="heading 1" w:semiHidden="0" w:uiPriority="9" w:unhideWhenUsed="0" w:qFormat="1"/>
-    <w:lsdException w:name="heading 2" w:uiPriority="9" w:qFormat="1"/>
-    <w:lsdException w:name="heading 3" w:uiPriority="9" w:qFormat="1"/>
-    <w:lsdException w:name="heading 4" w:uiPriority="9" w:qFormat="1"/>
-    <w:lsdException w:name="heading 5" w:uiPriority="9" w:qFormat="1"/>
-    <w:lsdException w:name="heading 6" w:uiPriority="9" w:qFormat="1"/>
-    <w:lsdException w:name="heading 7" w:uiPriority="9" w:qFormat="1"/>
-    <w:lsdException w:name="heading 8" w:uiPriority="9" w:qFormat="1"/>
-    <w:lsdException w:name="heading 9" w:uiPriority="9" w:qFormat="1"/>
-    <w:lsdException w:name="toc 1" w:uiPriority="39"/>
-    <w:lsdException w:name="toc 2" w:uiPriority="39"/>
-    <w:lsdException w:name="toc 3" w:uiPriority="39"/>
-    <w:lsdException w:name="toc 4" w:uiPriority="39"/>
-    <w:lsdException w:name="toc 5" w:uiPriority="39"/>
-    <w:lsdException w:name="toc 6" w:uiPriority="39"/>
-    <w:lsdException w:name="toc 7" w:uiPriority="39"/>
-    <w:lsdException w:name="toc 8" w:uiPriority="39"/>
-    <w:lsdException w:name="toc 9" w:uiPriority="39"/>
-    <w:lsdException w:name="caption" w:uiPriority="35" w:qFormat="1"/>
-    <w:lsdException w:name="Title" w:semiHidden="0" w:uiPriority="10" w:unhideWhenUsed="0" w:qFormat="1"/>
-    <w:lsdException w:name="Default Paragraph Font" w:uiPriority="1"/>
-    <w:lsdException w:name="Subtitle" w:semiHidden="0" w:uiPriority="11" w:unhideWhenUsed="0" w:qFormat="1"/>
-    <w:lsdException w:name="Strong" w:semiHidden="0" w:uiPriority="22" w:unhideWhenUsed="0" w:qFormat="1"/>
-    <w:lsdException w:name="Emphasis" w:semiHidden="0" w:uiPriority="20" w:unhideWhenUsed="0" w:qFormat="1"/>
-    <w:lsdException w:name="Table Grid" w:semiHidden="0" w:uiPriority="39" w:unhideWhenUsed="0"/>
-    <w:lsdException w:name="Placeholder Text" w:unhideWhenUsed="0"/>
-    <w:lsdException w:name="No Spacing" w:semiHidden="0" w:uiPriority="1" w:unhideWhenUsed="0" w:qFormat="1"/>
-    <w:lsdException w:name="Light Shading" w:semiHidden="0" w:uiPriority="60" w:unhideWhenUsed="0"/>
-    <w:lsdException w:name="Light List" w:semiHidden="0" w:uiPriority="61" w:unhideWhenUsed="0"/>
-    <w:lsdException w:name="Light Grid" w:semiHidden="0" w:uiPriority="62" w:unhideWhenUsed="0"/>
-    <w:lsdException w:name="Medium Shading 1" w:semiHidden="0" w:uiPriority="63" w:unhideWhenUsed="0"/>
-    <w:lsdException w:name="Medium Shading 2" w:semiHidden="0" w:uiPriority="64" w:unhideWhenUsed="0"/>
-    <w:lsdException w:name="Medium List 1" w:semiHidden="0" w:uiPriority="65" w:unhideWhenUsed="0"/>
-    <w:lsdException w:name="Medium List 2" w:semiHidden="0" w:uiPriority="66" w:unhideWhenUsed="0"/>
-    <w:lsdException w:name="Medium Grid 1" w:semiHidden="0" w:uiPriority="67" w:unhideWhenUsed="0"/>
-    <w:lsdException w:name="Medium Grid 2" w:semiHidden="0" w:uiPriority="68" w:unhideWhenUsed="0"/>
-    <w:lsdException w:name="Medium Grid 3" w:semiHidden="0" w:uiPriority="69" w:unhideWhenUsed="0"/>
-    <w:lsdException w:name="Dark List" w:semiHidden="0" w:uiPriority="70" w:unhideWhenUsed="0"/>
-    <w:lsdException w:name="Colorful Shading" w:semiHidden="0" w:uiPriority="71" w:unhideWhenUsed="0"/>
-    <w:lsdException w:name="Colorful List" w:semiHidden="0" w:uiPriority="72" w:unhideWhenUsed="0"/>
-    <w:lsdException w:name="Colorful Grid" w:semiHidden="0" w:uiPriority="73" w:unhideWhenUsed="0"/>
-    <w:lsdException w:name="Light Shading Accent 1" w:semiHidden="0" w:uiPriority="60" w:unhideWhenUsed="0"/>
-    <w:lsdException w:name="Light List Accent 1" w:semiHidden="0" w:uiPriority="61" w:unhideWhenUsed="0"/>
-    <w:lsdException w:name="Light Grid Accent 1" w:semiHidden="0" w:uiPriority="62" w:unhideWhenUsed="0"/>
-    <w:lsdException w:name="Medium Shading 1 Accent 1" w:semiHidden="0" w:uiPriority="63" w:unhideWhenUsed="0"/>
-    <w:lsdException w:name="Medium Shading 2 Accent 1" w:semiHidden="0" w:uiPriority="64" w:unhideWhenUsed="0"/>
-    <w:lsdException w:name="Medium List 1 Accent 1" w:semiHidden="0" w:uiPriority="65" w:unhideWhenUsed="0"/>
-    <w:lsdException w:name="Revision" w:unhideWhenUsed="0"/>
-    <w:lsdException w:name="List Paragraph" w:semiHidden="0" w:uiPriority="34" w:unhideWhenUsed="0" w:qFormat="1"/>
-    <w:lsdException w:name="Quote" w:semiHidden="0" w:uiPriority="29" w:unhideWhenUsed="0" w:qFormat="1"/>
-    <w:lsdException w:name="Intense Quote" w:semiHidden="0" w:uiPriority="30" w:unhideWhenUsed="0" w:qFormat="1"/>
-    <w:lsdException w:name="Medium List 2 Accent 1" w:semiHidden="0" w:uiPriority="66" w:unhideWhenUsed="0"/>
-    <w:lsdException w:name="Medium Grid 1 Accent 1" w:semiHidden="0" w:uiPriority="67" w:unhideWhenUsed="0"/>
-    <w:lsdException w:name="Medium Grid 2 Accent 1" w:semiHidden="0" w:uiPriority="68" w:unhideWhenUsed="0"/>
-    <w:lsdException w:name="Medium Grid 3 Accent 1" w:semiHidden="0" w:uiPriority="69" w:unhideWhenUsed="0"/>
-    <w:lsdException w:name="Dark List Accent 1" w:semiHidden="0" w:uiPriority="70" w:unhideWhenUsed="0"/>
-    <w:lsdException w:name="Colorful Shading Accent 1" w:semiHidden="0" w:uiPriority="71" w:unhideWhenUsed="0"/>
-    <w:lsdException w:name="Colorful List Accent 1" w:semiHidden="0" w:uiPriority="72" w:unhideWhenUsed="0"/>
-    <w:lsdException w:name="Colorful Grid Accent 1" w:semiHidden="0" w:uiPriority="73" w:unhideWhenUsed="0"/>
-    <w:lsdException w:name="Light Shading Accent 2" w:semiHidden="0" w:uiPriority="60" w:unhideWhenUsed="0"/>
-    <w:lsdException w:name="Light List Accent 2" w:semiHidden="0" w:uiPriority="61" w:unhideWhenUsed="0"/>
-    <w:lsdException w:name="Light Grid Accent 2" w:semiHidden="0" w:uiPriority="62" w:unhideWhenUsed="0"/>
-    <w:lsdException w:name="Medium Shading 1 Accent 2" w:semiHidden="0" w:uiPriority="63" w:unhideWhenUsed="0"/>
-    <w:lsdException w:name="Medium Shading 2 Accent 2" w:semiHidden="0" w:uiPriority="64" w:unhideWhenUsed="0"/>
-    <w:lsdException w:name="Medium List 1 Accent 2" w:semiHidden="0" w:uiPriority="65" w:unhideWhenUsed="0"/>
-    <w:lsdException w:name="Medium List 2 Accent 2" w:semiHidden="0" w:uiPriority="66" w:unhideWhenUsed="0"/>
-    <w:lsdException w:name="Medium Grid 1 Accent 2" w:semiHidden="0" w:uiPriority="67" w:unhideWhenUsed="0"/>
-    <w:lsdException w:name="Medium Grid 2 Accent 2" w:semiHidden="0" w:uiPriority="68" w:unhideWhenUsed="0"/>
-    <w:lsdException w:name="Medium Grid 3 Accent 2" w:semiHidden="0" w:uiPriority="69" w:unhideWhenUsed="0"/>
-    <w:lsdException w:name="Dark List Accent 2" w:semiHidden="0" w:uiPriority="70" w:unhideWhenUsed="0"/>
-    <w:lsdException w:name="Colorful Shading Accent 2" w:semiHidden="0" w:uiPriority="71" w:unhideWhenUsed="0"/>
-    <w:lsdException w:name="Colorful List Accent 2" w:semiHidden="0" w:uiPriority="72" w:unhideWhenUsed="0"/>
-    <w:lsdException w:name="Colorful Grid Accent 2" w:semiHidden="0" w:uiPriority="73" w:unhideWhenUsed="0"/>
-    <w:lsdException w:name="Light Shading Accent 3" w:semiHidden="0" w:uiPriority="60" w:unhideWhenUsed="0"/>
-    <w:lsdException w:name="Light List Accent 3" w:semiHidden="0" w:uiPriority="61" w:unhideWhenUsed="0"/>
-    <w:lsdException w:name="Light Grid Accent 3" w:semiHidden="0" w:uiPriority="62" w:unhideWhenUsed="0"/>
-    <w:lsdException w:name="Medium Shading 1 Accent 3" w:semiHidden="0" w:uiPriority="63" w:unhideWhenUsed="0"/>
-    <w:lsdException w:name="Medium Shading 2 Accent 3" w:semiHidden="0" w:uiPriority="64" w:unhideWhenUsed="0"/>
-    <w:lsdException w:name="Medium List 1 Accent 3" w:semiHidden="0" w:uiPriority="65" w:unhideWhenUsed="0"/>
-    <w:lsdException w:name="Medium List 2 Accent 3" w:semiHidden="0" w:uiPriority="66" w:unhideWhenUsed="0"/>
-    <w:lsdException w:name="Medium Grid 1 Accent 3" w:semiHidden="0" w:uiPriority="67" w:unhideWhenUsed="0"/>
-    <w:lsdException w:name="Medium Grid 2 Accent 3" w:semiHidden="0" w:uiPriority="68" w:unhideWhenUsed="0"/>
-    <w:lsdException w:name="Medium Grid 3 Accent 3" w:semiHidden="0" w:uiPriority="69" w:unhideWhenUsed="0"/>
-    <w:lsdException w:name="Dark List Accent 3" w:semiHidden="0" w:uiPriority="70" w:unhideWhenUsed="0"/>
-    <w:lsdException w:name="Colorful Shading Accent 3" w:semiHidden="0" w:uiPriority="71" w:unhideWhenUsed="0"/>
-    <w:lsdException w:name="Colorful List Accent 3" w:semiHidden="0" w:uiPriority="72" w:unhideWhenUsed="0"/>
-    <w:lsdException w:name="Colorful Grid Accent 3" w:semiHidden="0" w:uiPriority="73" w:unhideWhenUsed="0"/>
-    <w:lsdException w:name="Light Shading Accent 4" w:semiHidden="0" w:uiPriority="60" w:unhideWhenUsed="0"/>
-    <w:lsdException w:name="Light List Accent 4" w:semiHidden="0" w:uiPriority="61" w:unhideWhenUsed="0"/>
-    <w:lsdException w:name="Light Grid Accent 4" w:semiHidden="0" w:uiPriority="62" w:unhideWhenUsed="0"/>
-    <w:lsdException w:name="Medium Shading 1 Accent 4" w:semiHidden="0" w:uiPriority="63" w:unhideWhenUsed="0"/>
-    <w:lsdException w:name="Medium Shading 2 Accent 4" w:semiHidden="0" w:uiPriority="64" w:unhideWhenUsed="0"/>
-    <w:lsdException w:name="Medium List 1 Accent 4" w:semiHidden="0" w:uiPriority="65" w:unhideWhenUsed="0"/>
-    <w:lsdException w:name="Medium List 2 Accent 4" w:semiHidden="0" w:uiPriority="66" w:unhideWhenUsed="0"/>
-    <w:lsdException w:name="Medium Grid 1 Accent 4" w:semiHidden="0" w:uiPriority="67" w:unhideWhenUsed="0"/>
-    <w:lsdException w:name="Medium Grid 2 Accent 4" w:semiHidden="0" w:uiPriority="68" w:unhideWhenUsed="0"/>
-    <w:lsdException w:name="Medium Grid 3 Accent 4" w:semiHidden="0" w:uiPriority="69" w:unhideWhenUsed="0"/>
-    <w:lsdException w:name="Dark List Accent 4" w:semiHidden="0" w:uiPriority="70" w:unhideWhenUsed="0"/>
-    <w:lsdException w:name="Colorful Shading Accent 4" w:semiHidden="0" w:uiPriority="71" w:unhideWhenUsed="0"/>
-    <w:lsdException w:name="Colorful List Accent 4" w:semiHidden="0" w:uiPriority="72" w:unhideWhenUsed="0"/>
-    <w:lsdException w:name="Colorful Grid Accent 4" w:semiHidden="0" w:uiPriority="73" w:unhideWhenUsed="0"/>
-    <w:lsdException w:name="Light Shading Accent 5" w:semiHidden="0" w:uiPriority="60" w:unhideWhenUsed="0"/>
-    <w:lsdException w:name="Light List Accent 5" w:semiHidden="0" w:uiPriority="61" w:unhideWhenUsed="0"/>
-    <w:lsdException w:name="Light Grid Accent 5" w:semiHidden="0" w:uiPriority="62" w:unhideWhenUsed="0"/>
-    <w:lsdException w:name="Medium Shading 1 Accent 5" w:semiHidden="0" w:uiPriority="63" w:unhideWhenUsed="0"/>
-    <w:lsdException w:name="Medium Shading 2 Accent 5" w:semiHidden="0" w:uiPriority="64" w:unhideWhenUsed="0"/>
-    <w:lsdException w:name="Medium List 1 Accent 5" w:semiHidden="0" w:uiPriority="65" w:unhideWhenUsed="0"/>
-    <w:lsdException w:name="Medium List 2 Accent 5" w:semiHidden="0" w:uiPriority="66" w:unhideWhenUsed="0"/>
-    <w:lsdException w:name="Medium Grid 1 Accent 5" w:semiHidden="0" w:uiPriority="67" w:unhideWhenUsed="0"/>
-    <w:lsdException w:name="Medium Grid 2 Accent 5" w:semiHidden="0" w:uiPriority="68" w:unhideWhenUsed="0"/>
-    <w:lsdException w:name="Medium Grid 3 Accent 5" w:semiHidden="0" w:uiPriority="69" w:unhideWhenUsed="0"/>
-    <w:lsdException w:name="Dark List Accent 5" w:semiHidden="0" w:uiPriority="70" w:unhideWhenUsed="0"/>
-    <w:lsdException w:name="Colorful Shading Accent 5" w:semiHidden="0" w:uiPriority="71" w:unhideWhenUsed="0"/>
-    <w:lsdException w:name="Colorful List Accent 5" w:semiHidden="0" w:uiPriority="72" w:unhideWhenUsed="0"/>
-    <w:lsdException w:name="Colorful Grid Accent 5" w:semiHidden="0" w:uiPriority="73" w:unhideWhenUsed="0"/>
-    <w:lsdException w:name="Light Shading Accent 6" w:semiHidden="0" w:uiPriority="60" w:unhideWhenUsed="0"/>
-    <w:lsdException w:name="Light List Accent 6" w:semiHidden="0" w:uiPriority="61" w:unhideWhenUsed="0"/>
-    <w:lsdException w:name="Light Grid Accent 6" w:semiHidden="0" w:uiPriority="62" w:unhideWhenUsed="0"/>
-    <w:lsdException w:name="Medium Shading 1 Accent 6" w:semiHidden="0" w:uiPriority="63" w:unhideWhenUsed="0"/>
-    <w:lsdException w:name="Medium Shading 2 Accent 6" w:semiHidden="0" w:uiPriority="64" w:unhideWhenUsed="0"/>
-    <w:lsdException w:name="Medium List 1 Accent 6" w:semiHidden="0" w:uiPriority="65" w:unhideWhenUsed="0"/>
-    <w:lsdException w:name="Medium List 2 Accent 6" w:semiHidden="0" w:uiPriority="66" w:unhideWhenUsed="0"/>
-    <w:lsdException w:name="Medium Grid 1 Accent 6" w:semiHidden="0" w:uiPriority="67" w:unhideWhenUsed="0"/>
-    <w:lsdException w:name="Medium Grid 2 Accent 6" w:semiHidden="0" w:uiPriority="68" w:unhideWhenUsed="0"/>
-    <w:lsdException w:name="Medium Grid 3 Accent 6" w:semiHidden="0" w:uiPriority="69" w:unhideWhenUsed="0"/>
-    <w:lsdException w:name="Dark List Accent 6" w:semiHidden="0" w:uiPriority="70" w:unhideWhenUsed="0"/>
-    <w:lsdException w:name="Colorful Shading Accent 6" w:semiHidden="0" w:uiPriority="71" w:unhideWhenUsed="0"/>
-    <w:lsdException w:name="Colorful List Accent 6" w:semiHidden="0" w:uiPriority="72" w:unhideWhenUsed="0"/>
-    <w:lsdException w:name="Colorful Grid Accent 6" w:semiHidden="0" w:uiPriority="73" w:unhideWhenUsed="0"/>
-    <w:lsdException w:name="Subtle Emphasis" w:semiHidden="0" w:uiPriority="19" w:unhideWhenUsed="0" w:qFormat="1"/>
-    <w:lsdException w:name="Intense Emphasis" w:semiHidden="0" w:uiPriority="21" w:unhideWhenUsed="0" w:qFormat="1"/>
-    <w:lsdException w:name="Subtle Reference" w:semiHidden="0" w:uiPriority="31" w:unhideWhenUsed="0" w:qFormat="1"/>
-    <w:lsdException w:name="Intense Reference" w:semiHidden="0" w:uiPriority="32" w:unhideWhenUsed="0" w:qFormat="1"/>
-    <w:lsdException w:name="Book Title" w:semiHidden="0" w:uiPriority="33" w:unhideWhenUsed="0" w:qFormat="1"/>
-    <w:lsdException w:name="Bibliography" w:uiPriority="37"/>
-    <w:lsdException w:name="TOC Heading" w:uiPriority="39" w:qFormat="1"/>
+  <w:latentStyles w:defLockedState="0" w:defUIPriority="99" w:defSemiHidden="0" w:defUnhideWhenUsed="0" w:defQFormat="0" w:count="376">
+    <w:lsdException w:name="Normal" w:uiPriority="0" w:qFormat="1"/>
+    <w:lsdException w:name="heading 1" w:uiPriority="9" w:qFormat="1"/>
+    <w:lsdException w:name="heading 2" w:semiHidden="1" w:uiPriority="9" w:unhideWhenUsed="1" w:qFormat="1"/>
+    <w:lsdException w:name="heading 3" w:semiHidden="1" w:uiPriority="9" w:unhideWhenUsed="1" w:qFormat="1"/>
+    <w:lsdException w:name="heading 4" w:semiHidden="1" w:uiPriority="9" w:unhideWhenUsed="1" w:qFormat="1"/>
+    <w:lsdException w:name="heading 5" w:semiHidden="1" w:uiPriority="9" w:unhideWhenUsed="1" w:qFormat="1"/>
+    <w:lsdException w:name="heading 6" w:semiHidden="1" w:uiPriority="9" w:unhideWhenUsed="1" w:qFormat="1"/>
+    <w:lsdException w:name="heading 7" w:semiHidden="1" w:uiPriority="9" w:unhideWhenUsed="1" w:qFormat="1"/>
+    <w:lsdException w:name="heading 8" w:semiHidden="1" w:uiPriority="9" w:unhideWhenUsed="1" w:qFormat="1"/>
+    <w:lsdException w:name="heading 9" w:semiHidden="1" w:uiPriority="9" w:unhideWhenUsed="1" w:qFormat="1"/>
+    <w:lsdException w:name="index 1" w:semiHidden="1" w:unhideWhenUsed="1"/>
+    <w:lsdException w:name="index 2" w:semiHidden="1" w:unhideWhenUsed="1"/>
+    <w:lsdException w:name="index 3" w:semiHidden="1" w:unhideWhenUsed="1"/>
+    <w:lsdException w:name="index 4" w:semiHidden="1" w:unhideWhenUsed="1"/>
+    <w:lsdException w:name="index 5" w:semiHidden="1" w:unhideWhenUsed="1"/>
+    <w:lsdException w:name="index 6" w:semiHidden="1" w:unhideWhenUsed="1"/>
+    <w:lsdException w:name="index 7" w:semiHidden="1" w:unhideWhenUsed="1"/>
+    <w:lsdException w:name="index 8" w:semiHidden="1" w:unhideWhenUsed="1"/>
+    <w:lsdException w:name="index 9" w:semiHidden="1" w:unhideWhenUsed="1"/>
+    <w:lsdException w:name="toc 1" w:semiHidden="1" w:uiPriority="39" w:unhideWhenUsed="1"/>
+    <w:lsdException w:name="toc 2" w:semiHidden="1" w:uiPriority="39" w:unhideWhenUsed="1"/>
+    <w:lsdException w:name="toc 3" w:semiHidden="1" w:uiPriority="39" w:unhideWhenUsed="1"/>
+    <w:lsdException w:name="toc 4" w:semiHidden="1" w:uiPriority="39" w:unhideWhenUsed="1"/>
+    <w:lsdException w:name="toc 5" w:semiHidden="1" w:uiPriority="39" w:unhideWhenUsed="1"/>
+    <w:lsdException w:name="toc 6" w:semiHidden="1" w:uiPriority="39" w:unhideWhenUsed="1"/>
+    <w:lsdException w:name="toc 7" w:semiHidden="1" w:uiPriority="39" w:unhideWhenUsed="1"/>
+    <w:lsdException w:name="toc 8" w:semiHidden="1" w:uiPriority="39" w:unhideWhenUsed="1"/>
+    <w:lsdException w:name="toc 9" w:semiHidden="1" w:uiPriority="39" w:unhideWhenUsed="1"/>
+    <w:lsdException w:name="Normal Indent" w:semiHidden="1" w:unhideWhenUsed="1"/>
+    <w:lsdException w:name="footnote text" w:semiHidden="1" w:unhideWhenUsed="1"/>
+    <w:lsdException w:name="annotation text" w:semiHidden="1" w:unhideWhenUsed="1"/>
+    <w:lsdException w:name="header" w:semiHidden="1" w:unhideWhenUsed="1"/>
+    <w:lsdException w:name="footer" w:semiHidden="1" w:unhideWhenUsed="1"/>
+    <w:lsdException w:name="index heading" w:semiHidden="1" w:unhideWhenUsed="1"/>
+    <w:lsdException w:name="caption" w:semiHidden="1" w:uiPriority="35" w:unhideWhenUsed="1" w:qFormat="1"/>
+    <w:lsdException w:name="table of figures" w:semiHidden="1" w:unhideWhenUsed="1"/>
+    <w:lsdException w:name="envelope address" w:semiHidden="1" w:unhideWhenUsed="1"/>
+    <w:lsdException w:name="envelope return" w:semiHidden="1" w:unhideWhenUsed="1"/>
+    <w:lsdException w:name="footnote reference" w:semiHidden="1" w:unhideWhenUsed="1"/>
+    <w:lsdException w:name="annotation reference" w:semiHidden="1" w:unhideWhenUsed="1"/>
+    <w:lsdException w:name="line number" w:semiHidden="1" w:unhideWhenUsed="1"/>
+    <w:lsdException w:name="page number" w:semiHidden="1" w:unhideWhenUsed="1"/>
+    <w:lsdException w:name="endnote reference" w:semiHidden="1" w:unhideWhenUsed="1"/>
+    <w:lsdException w:name="endnote text" w:semiHidden="1" w:unhideWhenUsed="1"/>
+    <w:lsdException w:name="table of authorities" w:semiHidden="1" w:unhideWhenUsed="1"/>
+    <w:lsdException w:name="macro" w:semiHidden="1" w:unhideWhenUsed="1"/>
+    <w:lsdException w:name="toa heading" w:semiHidden="1" w:unhideWhenUsed="1"/>
+    <w:lsdException w:name="List" w:semiHidden="1" w:unhideWhenUsed="1"/>
+    <w:lsdException w:name="List Bullet" w:semiHidden="1" w:unhideWhenUsed="1"/>
+    <w:lsdException w:name="List Number" w:semiHidden="1" w:unhideWhenUsed="1"/>
+    <w:lsdException w:name="List 2" w:semiHidden="1" w:unhideWhenUsed="1"/>
+    <w:lsdException w:name="List 3" w:semiHidden="1" w:unhideWhenUsed="1"/>
+    <w:lsdException w:name="List 4" w:semiHidden="1" w:unhideWhenUsed="1"/>
+    <w:lsdException w:name="List 5" w:semiHidden="1" w:unhideWhenUsed="1"/>
+    <w:lsdException w:name="List Bullet 2" w:semiHidden="1" w:unhideWhenUsed="1"/>
+    <w:lsdException w:name="List Bullet 3" w:semiHidden="1" w:unhideWhenUsed="1"/>
+    <w:lsdException w:name="List Bullet 4" w:semiHidden="1" w:unhideWhenUsed="1"/>
+    <w:lsdException w:name="List Bullet 5" w:semiHidden="1" w:unhideWhenUsed="1"/>
+    <w:lsdException w:name="List Number 2" w:semiHidden="1" w:unhideWhenUsed="1"/>
+    <w:lsdException w:name="List Number 3" w:semiHidden="1" w:unhideWhenUsed="1"/>
+    <w:lsdException w:name="List Number 4" w:semiHidden="1" w:unhideWhenUsed="1"/>
+    <w:lsdException w:name="List Number 5" w:semiHidden="1" w:unhideWhenUsed="1"/>
+    <w:lsdException w:name="Title" w:uiPriority="10" w:qFormat="1"/>
+    <w:lsdException w:name="Closing" w:semiHidden="1" w:unhideWhenUsed="1"/>
+    <w:lsdException w:name="Signature" w:semiHidden="1" w:unhideWhenUsed="1"/>
+    <w:lsdException w:name="Default Paragraph Font" w:semiHidden="1" w:uiPriority="1" w:unhideWhenUsed="1"/>
+    <w:lsdException w:name="Body Text" w:semiHidden="1" w:unhideWhenUsed="1"/>
+    <w:lsdException w:name="Body Text Indent" w:semiHidden="1" w:unhideWhenUsed="1"/>
+    <w:lsdException w:name="List Continue" w:semiHidden="1" w:unhideWhenUsed="1"/>
+    <w:lsdException w:name="List Continue 2" w:semiHidden="1" w:unhideWhenUsed="1"/>
+    <w:lsdException w:name="List Continue 3" w:semiHidden="1" w:unhideWhenUsed="1"/>
+    <w:lsdException w:name="List Continue 4" w:semiHidden="1" w:unhideWhenUsed="1"/>
+    <w:lsdException w:name="List Continue 5" w:semiHidden="1" w:unhideWhenUsed="1"/>
+    <w:lsdException w:name="Message Header" w:semiHidden="1" w:unhideWhenUsed="1"/>
+    <w:lsdException w:name="Subtitle" w:uiPriority="11" w:qFormat="1"/>
+    <w:lsdException w:name="Salutation" w:semiHidden="1" w:unhideWhenUsed="1"/>
+    <w:lsdException w:name="Date" w:semiHidden="1" w:unhideWhenUsed="1"/>
+    <w:lsdException w:name="Body Text First Indent" w:semiHidden="1" w:unhideWhenUsed="1"/>
+    <w:lsdException w:name="Body Text First Indent 2" w:semiHidden="1" w:unhideWhenUsed="1"/>
+    <w:lsdException w:name="Note Heading" w:semiHidden="1" w:unhideWhenUsed="1"/>
+    <w:lsdException w:name="Body Text 2" w:semiHidden="1" w:unhideWhenUsed="1"/>
+    <w:lsdException w:name="Body Text 3" w:semiHidden="1" w:unhideWhenUsed="1"/>
+    <w:lsdException w:name="Body Text Indent 2" w:semiHidden="1" w:unhideWhenUsed="1"/>
+    <w:lsdException w:name="Body Text Indent 3" w:semiHidden="1" w:unhideWhenUsed="1"/>
+    <w:lsdException w:name="Block Text" w:semiHidden="1" w:unhideWhenUsed="1"/>
+    <w:lsdException w:name="Hyperlink" w:semiHidden="1" w:unhideWhenUsed="1"/>
+    <w:lsdException w:name="FollowedHyperlink" w:semiHidden="1" w:unhideWhenUsed="1"/>
+    <w:lsdException w:name="Strong" w:uiPriority="22" w:qFormat="1"/>
+    <w:lsdException w:name="Emphasis" w:uiPriority="20" w:qFormat="1"/>
+    <w:lsdException w:name="Document Map" w:semiHidden="1" w:unhideWhenUsed="1"/>
+    <w:lsdException w:name="Plain Text" w:semiHidden="1" w:unhideWhenUsed="1"/>
+    <w:lsdException w:name="E-mail Signature" w:semiHidden="1" w:unhideWhenUsed="1"/>
+    <w:lsdException w:name="HTML Top of Form" w:semiHidden="1" w:unhideWhenUsed="1"/>
+    <w:lsdException w:name="HTML Bottom of Form" w:semiHidden="1" w:unhideWhenUsed="1"/>
+    <w:lsdException w:name="Normal (Web)" w:semiHidden="1" w:unhideWhenUsed="1"/>
+    <w:lsdException w:name="HTML Acronym" w:semiHidden="1" w:unhideWhenUsed="1"/>
+    <w:lsdException w:name="HTML Address" w:semiHidden="1" w:unhideWhenUsed="1"/>
+    <w:lsdException w:name="HTML Cite" w:semiHidden="1" w:unhideWhenUsed="1"/>
+    <w:lsdException w:name="HTML Code" w:semiHidden="1" w:unhideWhenUsed="1"/>
+    <w:lsdException w:name="HTML Definition" w:semiHidden="1" w:unhideWhenUsed="1"/>
+    <w:lsdException w:name="HTML Keyboard" w:semiHidden="1" w:unhideWhenUsed="1"/>
+    <w:lsdException w:name="HTML Preformatted" w:semiHidden="1" w:unhideWhenUsed="1"/>
+    <w:lsdException w:name="HTML Sample" w:semiHidden="1" w:unhideWhenUsed="1"/>
+    <w:lsdException w:name="HTML Typewriter" w:semiHidden="1" w:unhideWhenUsed="1"/>
+    <w:lsdException w:name="HTML Variable" w:semiHidden="1" w:unhideWhenUsed="1"/>
+    <w:lsdException w:name="Normal Table" w:semiHidden="1" w:unhideWhenUsed="1"/>
+    <w:lsdException w:name="annotation subject" w:semiHidden="1" w:unhideWhenUsed="1"/>
+    <w:lsdException w:name="No List" w:semiHidden="1" w:unhideWhenUsed="1"/>
+    <w:lsdException w:name="Outline List 1" w:semiHidden="1" w:unhideWhenUsed="1"/>
+    <w:lsdException w:name="Outline List 2" w:semiHidden="1" w:unhideWhenUsed="1"/>
+    <w:lsdException w:name="Outline List 3" w:semiHidden="1" w:unhideWhenUsed="1"/>
+    <w:lsdException w:name="Table Simple 1" w:semiHidden="1" w:unhideWhenUsed="1"/>
+    <w:lsdException w:name="Table Simple 2" w:semiHidden="1" w:unhideWhenUsed="1"/>
+    <w:lsdException w:name="Table Simple 3" w:semiHidden="1" w:unhideWhenUsed="1"/>
+    <w:lsdException w:name="Table Classic 1" w:semiHidden="1" w:unhideWhenUsed="1"/>
+    <w:lsdException w:name="Table Classic 2" w:semiHidden="1" w:unhideWhenUsed="1"/>
+    <w:lsdException w:name="Table Classic 3" w:semiHidden="1" w:unhideWhenUsed="1"/>
+    <w:lsdException w:name="Table Classic 4" w:semiHidden="1" w:unhideWhenUsed="1"/>
+    <w:lsdException w:name="Table Colorful 1" w:semiHidden="1" w:unhideWhenUsed="1"/>
+    <w:lsdException w:name="Table Colorful 2" w:semiHidden="1" w:unhideWhenUsed="1"/>
+    <w:lsdException w:name="Table Colorful 3" w:semiHidden="1" w:unhideWhenUsed="1"/>
+    <w:lsdException w:name="Table Columns 1" w:semiHidden="1" w:unhideWhenUsed="1"/>
+    <w:lsdException w:name="Table Columns 2" w:semiHidden="1" w:unhideWhenUsed="1"/>
+    <w:lsdException w:name="Table Columns 3" w:semiHidden="1" w:unhideWhenUsed="1"/>
+    <w:lsdException w:name="Table Columns 4" w:semiHidden="1" w:unhideWhenUsed="1"/>
+    <w:lsdException w:name="Table Columns 5" w:semiHidden="1" w:unhideWhenUsed="1"/>
+    <w:lsdException w:name="Table Grid 1" w:semiHidden="1" w:unhideWhenUsed="1"/>
+    <w:lsdException w:name="Table Grid 2" w:semiHidden="1" w:unhideWhenUsed="1"/>
+    <w:lsdException w:name="Table Grid 3" w:semiHidden="1" w:unhideWhenUsed="1"/>
+    <w:lsdException w:name="Table Grid 4" w:semiHidden="1" w:unhideWhenUsed="1"/>
+    <w:lsdException w:name="Table Grid 5" w:semiHidden="1" w:unhideWhenUsed="1"/>
+    <w:lsdException w:name="Table Grid 6" w:semiHidden="1" w:unhideWhenUsed="1"/>
+    <w:lsdException w:name="Table Grid 7" w:semiHidden="1" w:unhideWhenUsed="1"/>
+    <w:lsdException w:name="Table Grid 8" w:semiHidden="1" w:unhideWhenUsed="1"/>
+    <w:lsdException w:name="Table List 1" w:semiHidden="1" w:unhideWhenUsed="1"/>
+    <w:lsdException w:name="Table List 2" w:semiHidden="1" w:unhideWhenUsed="1"/>
+    <w:lsdException w:name="Table List 3" w:semiHidden="1" w:unhideWhenUsed="1"/>
+    <w:lsdException w:name="Table List 4" w:semiHidden="1" w:unhideWhenUsed="1"/>
+    <w:lsdException w:name="Table List 5" w:semiHidden="1" w:unhideWhenUsed="1"/>
+    <w:lsdException w:name="Table List 6" w:semiHidden="1" w:unhideWhenUsed="1"/>
+    <w:lsdException w:name="Table List 7" w:semiHidden="1" w:unhideWhenUsed="1"/>
+    <w:lsdException w:name="Table List 8" w:semiHidden="1" w:unhideWhenUsed="1"/>
+    <w:lsdException w:name="Table 3D effects 1" w:semiHidden="1" w:unhideWhenUsed="1"/>
+    <w:lsdException w:name="Table 3D effects 2" w:semiHidden="1" w:unhideWhenUsed="1"/>
+    <w:lsdException w:name="Table 3D effects 3" w:semiHidden="1" w:unhideWhenUsed="1"/>
+    <w:lsdException w:name="Table Contemporary" w:semiHidden="1" w:unhideWhenUsed="1"/>
+    <w:lsdException w:name="Table Elegant" w:semiHidden="1" w:unhideWhenUsed="1"/>
+    <w:lsdException w:name="Table Professional" w:semiHidden="1" w:unhideWhenUsed="1"/>
+    <w:lsdException w:name="Table Subtle 1" w:semiHidden="1" w:unhideWhenUsed="1"/>
+    <w:lsdException w:name="Table Subtle 2" w:semiHidden="1" w:unhideWhenUsed="1"/>
+    <w:lsdException w:name="Table Web 1" w:semiHidden="1" w:unhideWhenUsed="1"/>
+    <w:lsdException w:name="Table Web 2" w:semiHidden="1" w:unhideWhenUsed="1"/>
+    <w:lsdException w:name="Table Web 3" w:semiHidden="1" w:unhideWhenUsed="1"/>
+    <w:lsdException w:name="Balloon Text" w:semiHidden="1" w:unhideWhenUsed="1"/>
+    <w:lsdException w:name="Table Grid" w:uiPriority="39"/>
+    <w:lsdException w:name="Table Theme" w:semiHidden="1" w:unhideWhenUsed="1"/>
+    <w:lsdException w:name="Placeholder Text" w:semiHidden="1"/>
+    <w:lsdException w:name="No Spacing" w:uiPriority="1" w:qFormat="1"/>
+    <w:lsdException w:name="Light Shading" w:uiPriority="60"/>
+    <w:lsdException w:name="Light List" w:uiPriority="61"/>
+    <w:lsdException w:name="Light Grid" w:uiPriority="62"/>
+    <w:lsdException w:name="Medium Shading 1" w:uiPriority="63"/>
+    <w:lsdException w:name="Medium Shading 2" w:uiPriority="64"/>
+    <w:lsdException w:name="Medium List 1" w:uiPriority="65"/>
+    <w:lsdException w:name="Medium List 2" w:uiPriority="66"/>
+    <w:lsdException w:name="Medium Grid 1" w:uiPriority="67"/>
+    <w:lsdException w:name="Medium Grid 2" w:uiPriority="68"/>
+    <w:lsdException w:name="Medium Grid 3" w:uiPriority="69"/>
+    <w:lsdException w:name="Dark List" w:uiPriority="70"/>
+    <w:lsdException w:name="Colorful Shading" w:uiPriority="71"/>
+    <w:lsdException w:name="Colorful List" w:uiPriority="72"/>
+    <w:lsdException w:name="Colorful Grid" w:uiPriority="73"/>
+    <w:lsdException w:name="Light Shading Accent 1" w:uiPriority="60"/>
+    <w:lsdException w:name="Light List Accent 1" w:uiPriority="61"/>
+    <w:lsdException w:name="Light Grid Accent 1" w:uiPriority="62"/>
+    <w:lsdException w:name="Medium Shading 1 Accent 1" w:uiPriority="63"/>
+    <w:lsdException w:name="Medium Shading 2 Accent 1" w:uiPriority="64"/>
+    <w:lsdException w:name="Medium List 1 Accent 1" w:uiPriority="65"/>
+    <w:lsdException w:name="Revision" w:semiHidden="1"/>
+    <w:lsdException w:name="List Paragraph" w:uiPriority="34" w:qFormat="1"/>
+    <w:lsdException w:name="Quote" w:uiPriority="29" w:qFormat="1"/>
+    <w:lsdException w:name="Intense Quote" w:uiPriority="30" w:qFormat="1"/>
+    <w:lsdException w:name="Medium List 2 Accent 1" w:uiPriority="66"/>
+    <w:lsdException w:name="Medium Grid 1 Accent 1" w:uiPriority="67"/>
+    <w:lsdException w:name="Medium Grid 2 Accent 1" w:uiPriority="68"/>
+    <w:lsdException w:name="Medium Grid 3 Accent 1" w:uiPriority="69"/>
+    <w:lsdException w:name="Dark List Accent 1" w:uiPriority="70"/>
+    <w:lsdException w:name="Colorful Shading Accent 1" w:uiPriority="71"/>
+    <w:lsdException w:name="Colorful List Accent 1" w:uiPriority="72"/>
+    <w:lsdException w:name="Colorful Grid Accent 1" w:uiPriority="73"/>
+    <w:lsdException w:name="Light Shading Accent 2" w:uiPriority="60"/>
+    <w:lsdException w:name="Light List Accent 2" w:uiPriority="61"/>
+    <w:lsdException w:name="Light Grid Accent 2" w:uiPriority="62"/>
+    <w:lsdException w:name="Medium Shading 1 Accent 2" w:uiPriority="63"/>
+    <w:lsdException w:name="Medium Shading 2 Accent 2" w:uiPriority="64"/>
+    <w:lsdException w:name="Medium List 1 Accent 2" w:uiPriority="65"/>
+    <w:lsdException w:name="Medium List 2 Accent 2" w:uiPriority="66"/>
+    <w:lsdException w:name="Medium Grid 1 Accent 2" w:uiPriority="67"/>
+    <w:lsdException w:name="Medium Grid 2 Accent 2" w:uiPriority="68"/>
+    <w:lsdException w:name="Medium Grid 3 Accent 2" w:uiPriority="69"/>
+    <w:lsdException w:name="Dark List Accent 2" w:uiPriority="70"/>
+    <w:lsdException w:name="Colorful Shading Accent 2" w:uiPriority="71"/>
+    <w:lsdException w:name="Colorful List Accent 2" w:uiPriority="72"/>
+    <w:lsdException w:name="Colorful Grid Accent 2" w:uiPriority="73"/>
+    <w:lsdException w:name="Light Shading Accent 3" w:uiPriority="60"/>
+    <w:lsdException w:name="Light List Accent 3" w:uiPriority="61"/>
+    <w:lsdException w:name="Light Grid Accent 3" w:uiPriority="62"/>
+    <w:lsdException w:name="Medium Shading 1 Accent 3" w:uiPriority="63"/>
+    <w:lsdException w:name="Medium Shading 2 Accent 3" w:uiPriority="64"/>
+    <w:lsdException w:name="Medium List 1 Accent 3" w:uiPriority="65"/>
+    <w:lsdException w:name="Medium List 2 Accent 3" w:uiPriority="66"/>
+    <w:lsdException w:name="Medium Grid 1 Accent 3" w:uiPriority="67"/>
+    <w:lsdException w:name="Medium Grid 2 Accent 3" w:uiPriority="68"/>
+    <w:lsdException w:name="Medium Grid 3 Accent 3" w:uiPriority="69"/>
+    <w:lsdException w:name="Dark List Accent 3" w:uiPriority="70"/>
+    <w:lsdException w:name="Colorful Shading Accent 3" w:uiPriority="71"/>
+    <w:lsdException w:name="Colorful List Accent 3" w:uiPriority="72"/>
+    <w:lsdException w:name="Colorful Grid Accent 3" w:uiPriority="73"/>
+    <w:lsdException w:name="Light Shading Accent 4" w:uiPriority="60"/>
+    <w:lsdException w:name="Light List Accent 4" w:uiPriority="61"/>
+    <w:lsdException w:name="Light Grid Accent 4" w:uiPriority="62"/>
+    <w:lsdException w:name="Medium Shading 1 Accent 4" w:uiPriority="63"/>
+    <w:lsdException w:name="Medium Shading 2 Accent 4" w:uiPriority="64"/>
+    <w:lsdException w:name="Medium List 1 Accent 4" w:uiPriority="65"/>
+    <w:lsdException w:name="Medium List 2 Accent 4" w:uiPriority="66"/>
+    <w:lsdException w:name="Medium Grid 1 Accent 4" w:uiPriority="67"/>
+    <w:lsdException w:name="Medium Grid 2 Accent 4" w:uiPriority="68"/>
+    <w:lsdException w:name="Medium Grid 3 Accent 4" w:uiPriority="69"/>
+    <w:lsdException w:name="Dark List Accent 4" w:uiPriority="70"/>
+    <w:lsdException w:name="Colorful Shading Accent 4" w:uiPriority="71"/>
+    <w:lsdException w:name="Colorful List Accent 4" w:uiPriority="72"/>
+    <w:lsdException w:name="Colorful Grid Accent 4" w:uiPriority="73"/>
+    <w:lsdException w:name="Light Shading Accent 5" w:uiPriority="60"/>
+    <w:lsdException w:name="Light List Accent 5" w:uiPriority="61"/>
+    <w:lsdException w:name="Light Grid Accent 5" w:uiPriority="62"/>
+    <w:lsdException w:name="Medium Shading 1 Accent 5" w:uiPriority="63"/>
+    <w:lsdException w:name="Medium Shading 2 Accent 5" w:uiPriority="64"/>
+    <w:lsdException w:name="Medium List 1 Accent 5" w:uiPriority="65"/>
+    <w:lsdException w:name="Medium List 2 Accent 5" w:uiPriority="66"/>
+    <w:lsdException w:name="Medium Grid 1 Accent 5" w:uiPriority="67"/>
+    <w:lsdException w:name="Medium Grid 2 Accent 5" w:uiPriority="68"/>
+    <w:lsdException w:name="Medium Grid 3 Accent 5" w:uiPriority="69"/>
+    <w:lsdException w:name="Dark List Accent 5" w:uiPriority="70"/>
+    <w:lsdException w:name="Colorful Shading Accent 5" w:uiPriority="71"/>
+    <w:lsdException w:name="Colorful List Accent 5" w:uiPriority="72"/>
+    <w:lsdException w:name="Colorful Grid Accent 5" w:uiPriority="73"/>
+    <w:lsdException w:name="Light Shading Accent 6" w:uiPriority="60"/>
+    <w:lsdException w:name="Light List Accent 6" w:uiPriority="61"/>
+    <w:lsdException w:name="Light Grid Accent 6" w:uiPriority="62"/>
+    <w:lsdException w:name="Medium Shading 1 Accent 6" w:uiPriority="63"/>
+    <w:lsdException w:name="Medium Shading 2 Accent 6" w:uiPriority="64"/>
+    <w:lsdException w:name="Medium List 1 Accent 6" w:uiPriority="65"/>
+    <w:lsdException w:name="Medium List 2 Accent 6" w:uiPriority="66"/>
+    <w:lsdException w:name="Medium Grid 1 Accent 6" w:uiPriority="67"/>
+    <w:lsdException w:name="Medium Grid 2 Accent 6" w:uiPriority="68"/>
+    <w:lsdException w:name="Medium Grid 3 Accent 6" w:uiPriority="69"/>
+    <w:lsdException w:name="Dark List Accent 6" w:uiPriority="70"/>
+    <w:lsdException w:name="Colorful Shading Accent 6" w:uiPriority="71"/>
+    <w:lsdException w:name="Colorful List Accent 6" w:uiPriority="72"/>
+    <w:lsdException w:name="Colorful Grid Accent 6" w:uiPriority="73"/>
+    <w:lsdException w:name="Subtle Emphasis" w:uiPriority="19" w:qFormat="1"/>
+    <w:lsdException w:name="Intense Emphasis" w:uiPriority="21" w:qFormat="1"/>
+    <w:lsdException w:name="Subtle Reference" w:uiPriority="31" w:qFormat="1"/>
+    <w:lsdException w:name="Intense Reference" w:uiPriority="32" w:qFormat="1"/>
+    <w:lsdException w:name="Book Title" w:uiPriority="33" w:qFormat="1"/>
+    <w:lsdException w:name="Bibliography" w:semiHidden="1" w:uiPriority="37" w:unhideWhenUsed="1"/>
+    <w:lsdException w:name="TOC Heading" w:semiHidden="1" w:uiPriority="39" w:unhideWhenUsed="1" w:qFormat="1"/>
+    <w:lsdException w:name="Plain Table 1" w:uiPriority="41"/>
+    <w:lsdException w:name="Plain Table 2" w:uiPriority="42"/>
+    <w:lsdException w:name="Plain Table 3" w:uiPriority="43"/>
+    <w:lsdException w:name="Plain Table 4" w:uiPriority="44"/>
+    <w:lsdException w:name="Plain Table 5" w:uiPriority="45"/>
+    <w:lsdException w:name="Grid Table Light" w:uiPriority="40"/>
+    <w:lsdException w:name="Grid Table 1 Light" w:uiPriority="46"/>
+    <w:lsdException w:name="Grid Table 2" w:uiPriority="47"/>
+    <w:lsdException w:name="Grid Table 3" w:uiPriority="48"/>
+    <w:lsdException w:name="Grid Table 4" w:uiPriority="49"/>
+    <w:lsdException w:name="Grid Table 5 Dark" w:uiPriority="50"/>
+    <w:lsdException w:name="Grid Table 6 Colorful" w:uiPriority="51"/>
+    <w:lsdException w:name="Grid Table 7 Colorful" w:uiPriority="52"/>
+    <w:lsdException w:name="Grid Table 1 Light Accent 1" w:uiPriority="46"/>
+    <w:lsdException w:name="Grid Table 2 Accent 1" w:uiPriority="47"/>
+    <w:lsdException w:name="Grid Table 3 Accent 1" w:uiPriority="48"/>
+    <w:lsdException w:name="Grid Table 4 Accent 1" w:uiPriority="49"/>
+    <w:lsdException w:name="Grid Table 5 Dark Accent 1" w:uiPriority="50"/>
+    <w:lsdException w:name="Grid Table 6 Colorful Accent 1" w:uiPriority="51"/>
+    <w:lsdException w:name="Grid Table 7 Colorful Accent 1" w:uiPriority="52"/>
+    <w:lsdException w:name="Grid Table 1 Light Accent 2" w:uiPriority="46"/>
+    <w:lsdException w:name="Grid Table 2 Accent 2" w:uiPriority="47"/>
+    <w:lsdException w:name="Grid Table 3 Accent 2" w:uiPriority="48"/>
+    <w:lsdException w:name="Grid Table 4 Accent 2" w:uiPriority="49"/>
+    <w:lsdException w:name="Grid Table 5 Dark Accent 2" w:uiPriority="50"/>
+    <w:lsdException w:name="Grid Table 6 Colorful Accent 2" w:uiPriority="51"/>
+    <w:lsdException w:name="Grid Table 7 Colorful Accent 2" w:uiPriority="52"/>
+    <w:lsdException w:name="Grid Table 1 Light Accent 3" w:uiPriority="46"/>
+    <w:lsdException w:name="Grid Table 2 Accent 3" w:uiPriority="47"/>
+    <w:lsdException w:name="Grid Table 3 Accent 3" w:uiPriority="48"/>
+    <w:lsdException w:name="Grid Table 4 Accent 3" w:uiPriority="49"/>
+    <w:lsdException w:name="Grid Table 5 Dark Accent 3" w:uiPriority="50"/>
+    <w:lsdException w:name="Grid Table 6 Colorful Accent 3" w:uiPriority="51"/>
+    <w:lsdException w:name="Grid Table 7 Colorful Accent 3" w:uiPriority="52"/>
+    <w:lsdException w:name="Grid Table 1 Light Accent 4" w:uiPriority="46"/>
+    <w:lsdException w:name="Grid Table 2 Accent 4" w:uiPriority="47"/>
+    <w:lsdException w:name="Grid Table 3 Accent 4" w:uiPriority="48"/>
+    <w:lsdException w:name="Grid Table 4 Accent 4" w:uiPriority="49"/>
+    <w:lsdException w:name="Grid Table 5 Dark Accent 4" w:uiPriority="50"/>
+    <w:lsdException w:name="Grid Table 6 Colorful Accent 4" w:uiPriority="51"/>
+    <w:lsdException w:name="Grid Table 7 Colorful Accent 4" w:uiPriority="52"/>
+    <w:lsdException w:name="Grid Table 1 Light Accent 5" w:uiPriority="46"/>
+    <w:lsdException w:name="Grid Table 2 Accent 5" w:uiPriority="47"/>
+    <w:lsdException w:name="Grid Table 3 Accent 5" w:uiPriority="48"/>
+    <w:lsdException w:name="Grid Table 4 Accent 5" w:uiPriority="49"/>
+    <w:lsdException w:name="Grid Table 5 Dark Accent 5" w:uiPriority="50"/>
+    <w:lsdException w:name="Grid Table 6 Colorful Accent 5" w:uiPriority="51"/>
+    <w:lsdException w:name="Grid Table 7 Colorful Accent 5" w:uiPriority="52"/>
+    <w:lsdException w:name="Grid Table 1 Light Accent 6" w:uiPriority="46"/>
+    <w:lsdException w:name="Grid Table 2 Accent 6" w:uiPriority="47"/>
+    <w:lsdException w:name="Grid Table 3 Accent 6" w:uiPriority="48"/>
+    <w:lsdException w:name="Grid Table 4 Accent 6" w:uiPriority="49"/>
+    <w:lsdException w:name="Grid Table 5 Dark Accent 6" w:uiPriority="50"/>
+    <w:lsdException w:name="Grid Table 6 Colorful Accent 6" w:uiPriority="51"/>
+    <w:lsdException w:name="Grid Table 7 Colorful Accent 6" w:uiPriority="52"/>
+    <w:lsdException w:name="List Table 1 Light" w:uiPriority="46"/>
+    <w:lsdException w:name="List Table 2" w:uiPriority="47"/>
+    <w:lsdException w:name="List Table 3" w:uiPriority="48"/>
+    <w:lsdException w:name="List Table 4" w:uiPriority="49"/>
+    <w:lsdException w:name="List Table 5 Dark" w:uiPriority="50"/>
+    <w:lsdException w:name="List Table 6 Colorful" w:uiPriority="51"/>
+    <w:lsdException w:name="List Table 7 Colorful" w:uiPriority="52"/>
+    <w:lsdException w:name="List Table 1 Light Accent 1" w:uiPriority="46"/>
+    <w:lsdException w:name="List Table 2 Accent 1" w:uiPriority="47"/>
+    <w:lsdException w:name="List Table 3 Accent 1" w:uiPriority="48"/>
+    <w:lsdException w:name="List Table 4 Accent 1" w:uiPriority="49"/>
+    <w:lsdException w:name="List Table 5 Dark Accent 1" w:uiPriority="50"/>
+    <w:lsdException w:name="List Table 6 Colorful Accent 1" w:uiPriority="51"/>
+    <w:lsdException w:name="List Table 7 Colorful Accent 1" w:uiPriority="52"/>
+    <w:lsdException w:name="List Table 1 Light Accent 2" w:uiPriority="46"/>
+    <w:lsdException w:name="List Table 2 Accent 2" w:uiPriority="47"/>
+    <w:lsdException w:name="List Table 3 Accent 2" w:uiPriority="48"/>
+    <w:lsdException w:name="List Table 4 Accent 2" w:uiPriority="49"/>
+    <w:lsdException w:name="List Table 5 Dark Accent 2" w:uiPriority="50"/>
+    <w:lsdException w:name="List Table 6 Colorful Accent 2" w:uiPriority="51"/>
+    <w:lsdException w:name="List Table 7 Colorful Accent 2" w:uiPriority="52"/>
+    <w:lsdException w:name="List Table 1 Light Accent 3" w:uiPriority="46"/>
+    <w:lsdException w:name="List Table 2 Accent 3" w:uiPriority="47"/>
+    <w:lsdException w:name="List Table 3 Accent 3" w:uiPriority="48"/>
+    <w:lsdException w:name="List Table 4 Accent 3" w:uiPriority="49"/>
+    <w:lsdException w:name="List Table 5 Dark Accent 3" w:uiPriority="50"/>
+    <w:lsdException w:name="List Table 6 Colorful Accent 3" w:uiPriority="51"/>
+    <w:lsdException w:name="List Table 7 Colorful Accent 3" w:uiPriority="52"/>
+    <w:lsdException w:name="List Table 1 Light Accent 4" w:uiPriority="46"/>
+    <w:lsdException w:name="List Table 2 Accent 4" w:uiPriority="47"/>
+    <w:lsdException w:name="List Table 3 Accent 4" w:uiPriority="48"/>
+    <w:lsdException w:name="List Table 4 Accent 4" w:uiPriority="49"/>
+    <w:lsdException w:name="List Table 5 Dark Accent 4" w:uiPriority="50"/>
+    <w:lsdException w:name="List Table 6 Colorful Accent 4" w:uiPriority="51"/>
+    <w:lsdException w:name="List Table 7 Colorful Accent 4" w:uiPriority="52"/>
+    <w:lsdException w:name="List Table 1 Light Accent 5" w:uiPriority="46"/>
+    <w:lsdException w:name="List Table 2 Accent 5" w:uiPriority="47"/>
+    <w:lsdException w:name="List Table 3 Accent 5" w:uiPriority="48"/>
+    <w:lsdException w:name="List Table 4 Accent 5" w:uiPriority="49"/>
+    <w:lsdException w:name="List Table 5 Dark Accent 5" w:uiPriority="50"/>
+    <w:lsdException w:name="List Table 6 Colorful Accent 5" w:uiPriority="51"/>
+    <w:lsdException w:name="List Table 7 Colorful Accent 5" w:uiPriority="52"/>
+    <w:lsdException w:name="List Table 1 Light Accent 6" w:uiPriority="46"/>
+    <w:lsdException w:name="List Table 2 Accent 6" w:uiPriority="47"/>
+    <w:lsdException w:name="List Table 3 Accent 6" w:uiPriority="48"/>
+    <w:lsdException w:name="List Table 4 Accent 6" w:uiPriority="49"/>
+    <w:lsdException w:name="List Table 5 Dark Accent 6" w:uiPriority="50"/>
+    <w:lsdException w:name="List Table 6 Colorful Accent 6" w:uiPriority="51"/>
+    <w:lsdException w:name="List Table 7 Colorful Accent 6" w:uiPriority="52"/>
+    <w:lsdException w:name="Mention" w:semiHidden="1" w:unhideWhenUsed="1"/>
+    <w:lsdException w:name="Smart Hyperlink" w:semiHidden="1" w:unhideWhenUsed="1"/>
+    <w:lsdException w:name="Hashtag" w:semiHidden="1" w:unhideWhenUsed="1"/>
+    <w:lsdException w:name="Unresolved Mention" w:semiHidden="1" w:unhideWhenUsed="1"/>
+    <w:lsdException w:name="Smart Link" w:semiHidden="1" w:unhideWhenUsed="1"/>
   </w:latentStyles>
   <w:style w:type="paragraph" w:default="1" w:styleId="Normal">
     <w:name w:val="Normal"/>
@@ -2307,7 +2308,6 @@
     <w:uiPriority w:val="99"/>
     <w:semiHidden/>
     <w:unhideWhenUsed/>
-    <w:qFormat/>
     <w:tblPr>
       <w:tblInd w:w="0" w:type="dxa"/>
       <w:tblCellMar>
@@ -2587,7 +2587,7 @@
   <a:extraClrSchemeLst/>
   <a:extLst>
     <a:ext uri="{05A4C25C-085E-4340-85A3-A5531E510DB2}">
-      <thm15:themeFamily xmlns:thm15="http://schemas.microsoft.com/office/thememl/2012/main" xmlns="" name="Office Theme" id="{62F939B6-93AF-4DB8-9C6B-D6C7DFDC589F}" vid="{4A3C46E8-61CC-4603-A589-7422A47A8E4A}"/>
+      <thm15:themeFamily xmlns:thm15="http://schemas.microsoft.com/office/thememl/2012/main" name="Office Theme" id="{62F939B6-93AF-4DB8-9C6B-D6C7DFDC589F}" vid="{4A3C46E8-61CC-4603-A589-7422A47A8E4A}"/>
     </a:ext>
   </a:extLst>
 </a:theme>

</xml_diff>